<commit_message>
chore: add Sentry monitoring (#8)
</commit_message>
<xml_diff>
--- a/ObsidianRoutes.docx
+++ b/ObsidianRoutes.docx
@@ -774,34 +774,6 @@
       </w:sdtContent>
     </w:sdt>
     <w:p/>
-    <w:p/>
-    <w:p/>
-    <w:p/>
-    <w:p/>
-    <w:p/>
-    <w:p/>
-    <w:p/>
-    <w:p/>
-    <w:p/>
-    <w:p/>
-    <w:p/>
-    <w:p/>
-    <w:p/>
-    <w:p/>
-    <w:p/>
-    <w:p/>
-    <w:p/>
-    <w:p/>
-    <w:p/>
-    <w:p/>
-    <w:p/>
-    <w:p/>
-    <w:p/>
-    <w:p/>
-    <w:p/>
-    <w:p/>
-    <w:p/>
-    <w:p/>
     <w:p>
       <w:pPr>
         <w:pStyle w:val="Heading1"/>
@@ -1197,7 +1169,15 @@
         <w:t xml:space="preserve"> the accurate service records. These </w:t>
       </w:r>
       <w:r>
-        <w:t xml:space="preserve">issues validated the need for a </w:t>
+        <w:t xml:space="preserve">issues validated the need for </w:t>
+      </w:r>
+      <w:proofErr w:type="spellStart"/>
+      <w:r>
+        <w:t>a</w:t>
+      </w:r>
+      <w:proofErr w:type="spellEnd"/>
+      <w:r>
+        <w:t xml:space="preserve"> </w:t>
       </w:r>
       <w:r>
         <w:t xml:space="preserve"> </w:t>
@@ -1344,13 +1324,27 @@
         <w:t xml:space="preserve">The core functionality </w:t>
       </w:r>
       <w:r>
-        <w:t xml:space="preserve">is t hat it uses real-time weather data from </w:t>
+        <w:t xml:space="preserve">is </w:t>
+      </w:r>
+      <w:r>
+        <w:t>that</w:t>
+      </w:r>
+      <w:r>
+        <w:t xml:space="preserve"> it uses real-time weather data from </w:t>
       </w:r>
       <w:r>
         <w:t>Weather API</w:t>
       </w:r>
       <w:r>
-        <w:t xml:space="preserve"> integrated with mapping services provided by Mapbox. Weather information is visualized as an overlay </w:t>
+        <w:t xml:space="preserve"> integrated with mapping services provided by </w:t>
+      </w:r>
+      <w:proofErr w:type="spellStart"/>
+      <w:r>
+        <w:t>Mapbox</w:t>
+      </w:r>
+      <w:proofErr w:type="spellEnd"/>
+      <w:r>
+        <w:t xml:space="preserve">. Weather information is visualized as an overlay </w:t>
       </w:r>
       <w:r>
         <w:t>directly on the route map with data points displayed at 10-15 Km intervals to give rider a comprehensive view of conditions they will be encountering through their journey.</w:t>
@@ -1411,6 +1405,7 @@
         <w:t>helping them top ride smarter and safer regardless of the conditions</w:t>
       </w:r>
     </w:p>
+    <w:p/>
     <w:sectPr>
       <w:pgSz w:w="11906" w:h="16838"/>
       <w:pgMar w:top="1440" w:right="1440" w:bottom="1440" w:left="1440" w:header="708" w:footer="708" w:gutter="0"/>
@@ -2654,9 +2649,11 @@
     <w:rsid w:val="000D462B"/>
     <w:rsid w:val="00103018"/>
     <w:rsid w:val="002F2260"/>
+    <w:rsid w:val="004004B6"/>
     <w:rsid w:val="0056085C"/>
     <w:rsid w:val="00566601"/>
     <w:rsid w:val="00806F0D"/>
+    <w:rsid w:val="00A058F4"/>
     <w:rsid w:val="00C77CF9"/>
     <w:rsid w:val="00CD0280"/>
     <w:rsid w:val="00F51DBC"/>

</xml_diff>